<commit_message>
feat: add Contact section with interactive form and resume download.
</commit_message>
<xml_diff>
--- a/src/assets/Examination.docx
+++ b/src/assets/Examination.docx
@@ -1144,7 +1144,7 @@
         <mc:AlternateContent>
           <mc:Choice Requires="wps">
             <w:drawing>
-              <wp:anchor distT="0" distB="0" distL="0" distR="0" simplePos="0" relativeHeight="251659264" behindDoc="1" locked="0" layoutInCell="1" allowOverlap="1" wp14:anchorId="552B3BBB" wp14:editId="769F6ADE">
+              <wp:anchor distT="0" distB="0" distL="0" distR="0" simplePos="0" relativeHeight="251659264" behindDoc="1" locked="0" layoutInCell="1" allowOverlap="1" wp14:anchorId="2807475F" wp14:editId="3A49C4CE">
                 <wp:simplePos x="0" y="0"/>
                 <wp:positionH relativeFrom="margin">
                   <wp:posOffset>-523875</wp:posOffset>
@@ -1236,7 +1236,7 @@
           </mc:Choice>
           <mc:Fallback>
             <w:pict>
-              <v:shapetype w14:anchorId="552B3BBB" id="_x0000_t202" coordsize="21600,21600" o:spt="202" path="m,l,21600r21600,l21600,xe">
+              <v:shapetype w14:anchorId="2807475F" id="_x0000_t202" coordsize="21600,21600" o:spt="202" path="m,l,21600r21600,l21600,xe">
                 <v:stroke joinstyle="miter"/>
                 <v:path gradientshapeok="t" o:connecttype="rect"/>
               </v:shapetype>
@@ -1379,17 +1379,7 @@
           <w:sz w:val="20"/>
           <w:szCs w:val="20"/>
         </w:rPr>
-        <w:t>Web Development</w:t>
-      </w:r>
-      <w:r>
-        <w:rPr>
-          <w:rFonts w:ascii="Times New Roman" w:hAnsi="Times New Roman" w:cs="Times New Roman"/>
-          <w:i/>
-          <w:color w:val="000000" w:themeColor="text1"/>
-          <w:sz w:val="20"/>
-          <w:szCs w:val="20"/>
-        </w:rPr>
-        <w:t>,</w:t>
+        <w:t>Web Development,</w:t>
       </w:r>
       <w:r>
         <w:rPr>
@@ -1996,7 +1986,7 @@
         <mc:AlternateContent>
           <mc:Choice Requires="wps">
             <w:drawing>
-              <wp:anchor distT="0" distB="0" distL="0" distR="0" simplePos="0" relativeHeight="251661312" behindDoc="1" locked="0" layoutInCell="1" allowOverlap="1" wp14:anchorId="3F992F01" wp14:editId="72AD17C5">
+              <wp:anchor distT="0" distB="0" distL="0" distR="0" simplePos="0" relativeHeight="251661312" behindDoc="1" locked="0" layoutInCell="1" allowOverlap="1" wp14:anchorId="3B0FDCA4" wp14:editId="6A905631">
                 <wp:simplePos x="0" y="0"/>
                 <wp:positionH relativeFrom="page">
                   <wp:posOffset>414655</wp:posOffset>
@@ -2070,7 +2060,7 @@
           </mc:Choice>
           <mc:Fallback>
             <w:pict>
-              <v:shape w14:anchorId="3F992F01" id="_x0000_s1027" type="#_x0000_t202" style="position:absolute;margin-left:32.65pt;margin-top:12.6pt;width:528.25pt;height:12.1pt;z-index:-251655168;visibility:visible;mso-wrap-style:square;mso-width-percent:0;mso-height-percent:0;mso-wrap-distance-left:0;mso-wrap-distance-top:0;mso-wrap-distance-right:0;mso-wrap-distance-bottom:0;mso-position-horizontal:absolute;mso-position-horizontal-relative:page;mso-position-vertical:absolute;mso-position-vertical-relative:text;mso-width-percent:0;mso-height-percent:0;mso-width-relative:margin;mso-height-relative:margin;v-text-anchor:top" o:gfxdata="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" fillcolor="#d9d9d9" stroked="f">
+              <v:shape w14:anchorId="3B0FDCA4" id="_x0000_s1027" type="#_x0000_t202" style="position:absolute;margin-left:32.65pt;margin-top:12.6pt;width:528.25pt;height:12.1pt;z-index:-251655168;visibility:visible;mso-wrap-style:square;mso-width-percent:0;mso-height-percent:0;mso-wrap-distance-left:0;mso-wrap-distance-top:0;mso-wrap-distance-right:0;mso-wrap-distance-bottom:0;mso-position-horizontal:absolute;mso-position-horizontal-relative:page;mso-position-vertical:absolute;mso-position-vertical-relative:text;mso-width-percent:0;mso-height-percent:0;mso-width-relative:margin;mso-height-relative:margin;v-text-anchor:top" o:gfxdata="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" fillcolor="#d9d9d9" stroked="f">
                 <v:textbox inset="0,0,0,0">
                   <w:txbxContent>
                     <w:p>
@@ -2167,8 +2157,6 @@
         </w:rPr>
         <w:t xml:space="preserve">   </w:t>
       </w:r>
-      <w:bookmarkStart w:id="0" w:name="_GoBack"/>
-      <w:bookmarkEnd w:id="0"/>
       <w:r>
         <w:rPr>
           <w:rFonts w:eastAsiaTheme="minorHAnsi"/>
@@ -2211,29 +2199,15 @@
           <w:rFonts w:eastAsiaTheme="minorHAnsi"/>
           <w:bCs/>
         </w:rPr>
-        <w:t>Sprout Knowledge Solution (</w:t>
-      </w:r>
+        <w:t>Sprout Knowledge Solution (Machine learning trainee 3</w:t>
+      </w:r>
+      <w:proofErr w:type="gramStart"/>
       <w:r>
         <w:rPr>
           <w:rFonts w:eastAsiaTheme="minorHAnsi"/>
           <w:bCs/>
         </w:rPr>
-        <w:t>Machine learning trainee 3</w:t>
-      </w:r>
-      <w:proofErr w:type="gramStart"/>
-      <w:r>
-        <w:rPr>
-          <w:rFonts w:eastAsiaTheme="minorHAnsi"/>
-          <w:bCs/>
-        </w:rPr>
-        <w:t>months</w:t>
-      </w:r>
-      <w:r>
-        <w:rPr>
-          <w:rFonts w:eastAsiaTheme="minorHAnsi"/>
-          <w:bCs/>
-        </w:rPr>
-        <w:t xml:space="preserve">)   </w:t>
+        <w:t xml:space="preserve">months)   </w:t>
       </w:r>
       <w:proofErr w:type="gramEnd"/>
       <w:r>
@@ -2335,7 +2309,12 @@
       </w:pPr>
     </w:p>
     <w:sectPr>
-      <w:headerReference w:type="default" r:id="rId7"/>
+      <w:headerReference w:type="even" r:id="rId7"/>
+      <w:headerReference w:type="default" r:id="rId8"/>
+      <w:footerReference w:type="even" r:id="rId9"/>
+      <w:footerReference w:type="default" r:id="rId10"/>
+      <w:headerReference w:type="first" r:id="rId11"/>
+      <w:footerReference w:type="first" r:id="rId12"/>
       <w:pgSz w:w="11906" w:h="16838"/>
       <w:pgMar w:top="1440" w:right="1440" w:bottom="1440" w:left="1440" w:header="113" w:footer="708" w:gutter="0"/>
       <w:cols w:space="708"/>
@@ -2370,6 +2349,36 @@
 </w:endnotes>
 </file>
 
+<file path=word/footer1.xml><?xml version="1.0" encoding="utf-8"?>
+<w:ftr xmlns:wpc="http://schemas.microsoft.com/office/word/2010/wordprocessingCanvas" xmlns:cx="http://schemas.microsoft.com/office/drawing/2014/chartex" xmlns:cx1="http://schemas.microsoft.com/office/drawing/2015/9/8/chartex" xmlns:cx2="http://schemas.microsoft.com/office/drawing/2015/10/21/chartex" xmlns:cx3="http://schemas.microsoft.com/office/drawing/2016/5/9/chartex" xmlns:cx4="http://schemas.microsoft.com/office/drawing/2016/5/10/chartex" xmlns:cx5="http://schemas.microsoft.com/office/drawing/2016/5/11/chartex" xmlns:cx6="http://schemas.microsoft.com/office/drawing/2016/5/12/chartex" xmlns:cx7="http://schemas.microsoft.com/office/drawing/2016/5/13/chartex" xmlns:cx8="http://schemas.microsoft.com/office/drawing/2016/5/14/chartex" xmlns:mc="http://schemas.openxmlformats.org/markup-compatibility/2006" xmlns:aink="http://schemas.microsoft.com/office/drawing/2016/ink" xmlns:am3d="http://schemas.microsoft.com/office/drawing/2017/model3d" xmlns:o="urn:schemas-microsoft-com:office:office" xmlns:r="http://schemas.openxmlformats.org/officeDocument/2006/relationships" xmlns:m="http://schemas.openxmlformats.org/officeDocument/2006/math" xmlns:v="urn:schemas-microsoft-com:vml" xmlns:wp14="http://schemas.microsoft.com/office/word/2010/wordprocessingDrawing" xmlns:wp="http://schemas.openxmlformats.org/drawingml/2006/wordprocessingDrawing" xmlns:w10="urn:schemas-microsoft-com:office:word" xmlns:w="http://schemas.openxmlformats.org/wordprocessingml/2006/main" xmlns:w14="http://schemas.microsoft.com/office/word/2010/wordml" xmlns:w15="http://schemas.microsoft.com/office/word/2012/wordml" xmlns:w16cid="http://schemas.microsoft.com/office/word/2016/wordml/cid" xmlns:w16se="http://schemas.microsoft.com/office/word/2015/wordml/symex" xmlns:wpg="http://schemas.microsoft.com/office/word/2010/wordprocessingGroup" xmlns:wpi="http://schemas.microsoft.com/office/word/2010/wordprocessingInk" xmlns:wne="http://schemas.microsoft.com/office/word/2006/wordml" xmlns:wps="http://schemas.microsoft.com/office/word/2010/wordprocessingShape" mc:Ignorable="w14 w15 w16se w16cid wp14">
+  <w:p>
+    <w:pPr>
+      <w:pStyle w:val="Footer"/>
+    </w:pPr>
+  </w:p>
+</w:ftr>
+</file>
+
+<file path=word/footer2.xml><?xml version="1.0" encoding="utf-8"?>
+<w:ftr xmlns:wpc="http://schemas.microsoft.com/office/word/2010/wordprocessingCanvas" xmlns:cx="http://schemas.microsoft.com/office/drawing/2014/chartex" xmlns:cx1="http://schemas.microsoft.com/office/drawing/2015/9/8/chartex" xmlns:cx2="http://schemas.microsoft.com/office/drawing/2015/10/21/chartex" xmlns:cx3="http://schemas.microsoft.com/office/drawing/2016/5/9/chartex" xmlns:cx4="http://schemas.microsoft.com/office/drawing/2016/5/10/chartex" xmlns:cx5="http://schemas.microsoft.com/office/drawing/2016/5/11/chartex" xmlns:cx6="http://schemas.microsoft.com/office/drawing/2016/5/12/chartex" xmlns:cx7="http://schemas.microsoft.com/office/drawing/2016/5/13/chartex" xmlns:cx8="http://schemas.microsoft.com/office/drawing/2016/5/14/chartex" xmlns:mc="http://schemas.openxmlformats.org/markup-compatibility/2006" xmlns:aink="http://schemas.microsoft.com/office/drawing/2016/ink" xmlns:am3d="http://schemas.microsoft.com/office/drawing/2017/model3d" xmlns:o="urn:schemas-microsoft-com:office:office" xmlns:r="http://schemas.openxmlformats.org/officeDocument/2006/relationships" xmlns:m="http://schemas.openxmlformats.org/officeDocument/2006/math" xmlns:v="urn:schemas-microsoft-com:vml" xmlns:wp14="http://schemas.microsoft.com/office/word/2010/wordprocessingDrawing" xmlns:wp="http://schemas.openxmlformats.org/drawingml/2006/wordprocessingDrawing" xmlns:w10="urn:schemas-microsoft-com:office:word" xmlns:w="http://schemas.openxmlformats.org/wordprocessingml/2006/main" xmlns:w14="http://schemas.microsoft.com/office/word/2010/wordml" xmlns:w15="http://schemas.microsoft.com/office/word/2012/wordml" xmlns:w16cid="http://schemas.microsoft.com/office/word/2016/wordml/cid" xmlns:w16se="http://schemas.microsoft.com/office/word/2015/wordml/symex" xmlns:wpg="http://schemas.microsoft.com/office/word/2010/wordprocessingGroup" xmlns:wpi="http://schemas.microsoft.com/office/word/2010/wordprocessingInk" xmlns:wne="http://schemas.microsoft.com/office/word/2006/wordml" xmlns:wps="http://schemas.microsoft.com/office/word/2010/wordprocessingShape" mc:Ignorable="w14 w15 w16se w16cid wp14">
+  <w:p>
+    <w:pPr>
+      <w:pStyle w:val="Footer"/>
+    </w:pPr>
+  </w:p>
+</w:ftr>
+</file>
+
+<file path=word/footer3.xml><?xml version="1.0" encoding="utf-8"?>
+<w:ftr xmlns:wpc="http://schemas.microsoft.com/office/word/2010/wordprocessingCanvas" xmlns:cx="http://schemas.microsoft.com/office/drawing/2014/chartex" xmlns:cx1="http://schemas.microsoft.com/office/drawing/2015/9/8/chartex" xmlns:cx2="http://schemas.microsoft.com/office/drawing/2015/10/21/chartex" xmlns:cx3="http://schemas.microsoft.com/office/drawing/2016/5/9/chartex" xmlns:cx4="http://schemas.microsoft.com/office/drawing/2016/5/10/chartex" xmlns:cx5="http://schemas.microsoft.com/office/drawing/2016/5/11/chartex" xmlns:cx6="http://schemas.microsoft.com/office/drawing/2016/5/12/chartex" xmlns:cx7="http://schemas.microsoft.com/office/drawing/2016/5/13/chartex" xmlns:cx8="http://schemas.microsoft.com/office/drawing/2016/5/14/chartex" xmlns:mc="http://schemas.openxmlformats.org/markup-compatibility/2006" xmlns:aink="http://schemas.microsoft.com/office/drawing/2016/ink" xmlns:am3d="http://schemas.microsoft.com/office/drawing/2017/model3d" xmlns:o="urn:schemas-microsoft-com:office:office" xmlns:r="http://schemas.openxmlformats.org/officeDocument/2006/relationships" xmlns:m="http://schemas.openxmlformats.org/officeDocument/2006/math" xmlns:v="urn:schemas-microsoft-com:vml" xmlns:wp14="http://schemas.microsoft.com/office/word/2010/wordprocessingDrawing" xmlns:wp="http://schemas.openxmlformats.org/drawingml/2006/wordprocessingDrawing" xmlns:w10="urn:schemas-microsoft-com:office:word" xmlns:w="http://schemas.openxmlformats.org/wordprocessingml/2006/main" xmlns:w14="http://schemas.microsoft.com/office/word/2010/wordml" xmlns:w15="http://schemas.microsoft.com/office/word/2012/wordml" xmlns:w16cid="http://schemas.microsoft.com/office/word/2016/wordml/cid" xmlns:w16se="http://schemas.microsoft.com/office/word/2015/wordml/symex" xmlns:wpg="http://schemas.microsoft.com/office/word/2010/wordprocessingGroup" xmlns:wpi="http://schemas.microsoft.com/office/word/2010/wordprocessingInk" xmlns:wne="http://schemas.microsoft.com/office/word/2006/wordml" xmlns:wps="http://schemas.microsoft.com/office/word/2010/wordprocessingShape" mc:Ignorable="w14 w15 w16se w16cid wp14">
+  <w:p>
+    <w:pPr>
+      <w:pStyle w:val="Footer"/>
+    </w:pPr>
+  </w:p>
+</w:ftr>
+</file>
+
 <file path=word/footnotes.xml><?xml version="1.0" encoding="utf-8"?>
 <w:footnotes xmlns:wpc="http://schemas.microsoft.com/office/word/2010/wordprocessingCanvas" xmlns:cx="http://schemas.microsoft.com/office/drawing/2014/chartex" xmlns:cx1="http://schemas.microsoft.com/office/drawing/2015/9/8/chartex" xmlns:cx2="http://schemas.microsoft.com/office/drawing/2015/10/21/chartex" xmlns:cx3="http://schemas.microsoft.com/office/drawing/2016/5/9/chartex" xmlns:cx4="http://schemas.microsoft.com/office/drawing/2016/5/10/chartex" xmlns:cx5="http://schemas.microsoft.com/office/drawing/2016/5/11/chartex" xmlns:cx6="http://schemas.microsoft.com/office/drawing/2016/5/12/chartex" xmlns:cx7="http://schemas.microsoft.com/office/drawing/2016/5/13/chartex" xmlns:cx8="http://schemas.microsoft.com/office/drawing/2016/5/14/chartex" xmlns:mc="http://schemas.openxmlformats.org/markup-compatibility/2006" xmlns:aink="http://schemas.microsoft.com/office/drawing/2016/ink" xmlns:am3d="http://schemas.microsoft.com/office/drawing/2017/model3d" xmlns:o="urn:schemas-microsoft-com:office:office" xmlns:r="http://schemas.openxmlformats.org/officeDocument/2006/relationships" xmlns:m="http://schemas.openxmlformats.org/officeDocument/2006/math" xmlns:v="urn:schemas-microsoft-com:vml" xmlns:wp14="http://schemas.microsoft.com/office/word/2010/wordprocessingDrawing" xmlns:wp="http://schemas.openxmlformats.org/drawingml/2006/wordprocessingDrawing" xmlns:w10="urn:schemas-microsoft-com:office:word" xmlns:w="http://schemas.openxmlformats.org/wordprocessingml/2006/main" xmlns:w14="http://schemas.microsoft.com/office/word/2010/wordml" xmlns:w15="http://schemas.microsoft.com/office/word/2012/wordml" xmlns:w16cid="http://schemas.microsoft.com/office/word/2016/wordml/cid" xmlns:w16se="http://schemas.microsoft.com/office/word/2015/wordml/symex" xmlns:wpg="http://schemas.microsoft.com/office/word/2010/wordprocessingGroup" xmlns:wpi="http://schemas.microsoft.com/office/word/2010/wordprocessingInk" xmlns:wne="http://schemas.microsoft.com/office/word/2006/wordml" xmlns:wps="http://schemas.microsoft.com/office/word/2010/wordprocessingShape" mc:Ignorable="w14 w15 w16se w16cid wp14">
   <w:footnote w:type="separator" w:id="-1">
@@ -2399,6 +2408,16 @@
 <w:hdr xmlns:wpc="http://schemas.microsoft.com/office/word/2010/wordprocessingCanvas" xmlns:cx="http://schemas.microsoft.com/office/drawing/2014/chartex" xmlns:cx1="http://schemas.microsoft.com/office/drawing/2015/9/8/chartex" xmlns:cx2="http://schemas.microsoft.com/office/drawing/2015/10/21/chartex" xmlns:cx3="http://schemas.microsoft.com/office/drawing/2016/5/9/chartex" xmlns:cx4="http://schemas.microsoft.com/office/drawing/2016/5/10/chartex" xmlns:cx5="http://schemas.microsoft.com/office/drawing/2016/5/11/chartex" xmlns:cx6="http://schemas.microsoft.com/office/drawing/2016/5/12/chartex" xmlns:cx7="http://schemas.microsoft.com/office/drawing/2016/5/13/chartex" xmlns:cx8="http://schemas.microsoft.com/office/drawing/2016/5/14/chartex" xmlns:mc="http://schemas.openxmlformats.org/markup-compatibility/2006" xmlns:aink="http://schemas.microsoft.com/office/drawing/2016/ink" xmlns:am3d="http://schemas.microsoft.com/office/drawing/2017/model3d" xmlns:o="urn:schemas-microsoft-com:office:office" xmlns:r="http://schemas.openxmlformats.org/officeDocument/2006/relationships" xmlns:m="http://schemas.openxmlformats.org/officeDocument/2006/math" xmlns:v="urn:schemas-microsoft-com:vml" xmlns:wp14="http://schemas.microsoft.com/office/word/2010/wordprocessingDrawing" xmlns:wp="http://schemas.openxmlformats.org/drawingml/2006/wordprocessingDrawing" xmlns:w10="urn:schemas-microsoft-com:office:word" xmlns:w="http://schemas.openxmlformats.org/wordprocessingml/2006/main" xmlns:w14="http://schemas.microsoft.com/office/word/2010/wordml" xmlns:w15="http://schemas.microsoft.com/office/word/2012/wordml" xmlns:w16cid="http://schemas.microsoft.com/office/word/2016/wordml/cid" xmlns:w16se="http://schemas.microsoft.com/office/word/2015/wordml/symex" xmlns:wpg="http://schemas.microsoft.com/office/word/2010/wordprocessingGroup" xmlns:wpi="http://schemas.microsoft.com/office/word/2010/wordprocessingInk" xmlns:wne="http://schemas.microsoft.com/office/word/2006/wordml" xmlns:wps="http://schemas.microsoft.com/office/word/2010/wordprocessingShape" mc:Ignorable="w14 w15 w16se w16cid wp14">
   <w:p>
     <w:pPr>
+      <w:pStyle w:val="Header"/>
+    </w:pPr>
+  </w:p>
+</w:hdr>
+</file>
+
+<file path=word/header2.xml><?xml version="1.0" encoding="utf-8"?>
+<w:hdr xmlns:wpc="http://schemas.microsoft.com/office/word/2010/wordprocessingCanvas" xmlns:cx="http://schemas.microsoft.com/office/drawing/2014/chartex" xmlns:cx1="http://schemas.microsoft.com/office/drawing/2015/9/8/chartex" xmlns:cx2="http://schemas.microsoft.com/office/drawing/2015/10/21/chartex" xmlns:cx3="http://schemas.microsoft.com/office/drawing/2016/5/9/chartex" xmlns:cx4="http://schemas.microsoft.com/office/drawing/2016/5/10/chartex" xmlns:cx5="http://schemas.microsoft.com/office/drawing/2016/5/11/chartex" xmlns:cx6="http://schemas.microsoft.com/office/drawing/2016/5/12/chartex" xmlns:cx7="http://schemas.microsoft.com/office/drawing/2016/5/13/chartex" xmlns:cx8="http://schemas.microsoft.com/office/drawing/2016/5/14/chartex" xmlns:mc="http://schemas.openxmlformats.org/markup-compatibility/2006" xmlns:aink="http://schemas.microsoft.com/office/drawing/2016/ink" xmlns:am3d="http://schemas.microsoft.com/office/drawing/2017/model3d" xmlns:o="urn:schemas-microsoft-com:office:office" xmlns:r="http://schemas.openxmlformats.org/officeDocument/2006/relationships" xmlns:m="http://schemas.openxmlformats.org/officeDocument/2006/math" xmlns:v="urn:schemas-microsoft-com:vml" xmlns:wp14="http://schemas.microsoft.com/office/word/2010/wordprocessingDrawing" xmlns:wp="http://schemas.openxmlformats.org/drawingml/2006/wordprocessingDrawing" xmlns:w10="urn:schemas-microsoft-com:office:word" xmlns:w="http://schemas.openxmlformats.org/wordprocessingml/2006/main" xmlns:w14="http://schemas.microsoft.com/office/word/2010/wordml" xmlns:w15="http://schemas.microsoft.com/office/word/2012/wordml" xmlns:w16cid="http://schemas.microsoft.com/office/word/2016/wordml/cid" xmlns:w16se="http://schemas.microsoft.com/office/word/2015/wordml/symex" xmlns:wpg="http://schemas.microsoft.com/office/word/2010/wordprocessingGroup" xmlns:wpi="http://schemas.microsoft.com/office/word/2010/wordprocessingInk" xmlns:wne="http://schemas.microsoft.com/office/word/2006/wordml" xmlns:wps="http://schemas.microsoft.com/office/word/2010/wordprocessingShape" mc:Ignorable="w14 w15 w16se w16cid wp14">
+  <w:p>
+    <w:pPr>
       <w:jc w:val="center"/>
       <w:rPr>
         <w:lang w:val="en-US"/>
@@ -2413,41 +2432,24 @@
   </w:p>
   <w:p>
     <w:pPr>
+      <w:ind w:left="-851"/>
       <w:jc w:val="center"/>
       <w:rPr>
         <w:lang w:val="en-US"/>
       </w:rPr>
     </w:pPr>
+    <w:r>
+      <w:rPr>
+        <w:lang w:val="en-US"/>
+      </w:rPr>
+      <w:t xml:space="preserve">+91 9047943317 </w:t>
+    </w:r>
     <w:hyperlink r:id="rId1" w:history="1">
       <w:r>
         <w:rPr>
           <w:rStyle w:val="Hyperlink"/>
           <w:lang w:val="en-US"/>
         </w:rPr>
-        <w:t>WEBSITE</w:t>
-      </w:r>
-    </w:hyperlink>
-  </w:p>
-  <w:p>
-    <w:pPr>
-      <w:ind w:left="-851"/>
-      <w:jc w:val="center"/>
-      <w:rPr>
-        <w:lang w:val="en-US"/>
-      </w:rPr>
-    </w:pPr>
-    <w:r>
-      <w:rPr>
-        <w:lang w:val="en-US"/>
-      </w:rPr>
-      <w:t xml:space="preserve">+91 9047943317 </w:t>
-    </w:r>
-    <w:hyperlink r:id="rId2" w:history="1">
-      <w:r>
-        <w:rPr>
-          <w:rStyle w:val="Hyperlink"/>
-          <w:lang w:val="en-US"/>
-        </w:rPr>
         <w:t>/abishekkc923@gmail.com</w:t>
       </w:r>
     </w:hyperlink>
@@ -2457,6 +2459,8 @@
       </w:rPr>
       <w:t xml:space="preserve"> /</w:t>
     </w:r>
+    <w:bookmarkStart w:id="0" w:name="_GoBack"/>
+    <w:bookmarkEnd w:id="0"/>
     <w:proofErr w:type="spellStart"/>
     <w:r>
       <w:fldChar w:fldCharType="begin"/>
@@ -2488,14 +2492,31 @@
       </w:rPr>
       <w:t xml:space="preserve"> /</w:t>
     </w:r>
-    <w:hyperlink r:id="rId3" w:history="1">
+    <w:hyperlink r:id="rId2" w:history="1">
       <w:r>
         <w:rPr>
           <w:rStyle w:val="Hyperlink"/>
           <w:lang w:val="en-US"/>
         </w:rPr>
-        <w:t>https://www.linkedin.com/in/abishekk-5457b4227</w:t>
-      </w:r>
+        <w:t>WEBSITE</w:t>
+      </w:r>
+    </w:hyperlink>
+    <w:r>
+      <w:rPr>
+        <w:lang w:val="en-US"/>
+      </w:rPr>
+      <w:t xml:space="preserve">/ </w:t>
+    </w:r>
+    <w:hyperlink r:id="rId3" w:history="1">
+      <w:proofErr w:type="spellStart"/>
+      <w:r>
+        <w:rPr>
+          <w:rStyle w:val="Hyperlink"/>
+          <w:lang w:val="en-US"/>
+        </w:rPr>
+        <w:t>linkedin</w:t>
+      </w:r>
+      <w:proofErr w:type="spellEnd"/>
     </w:hyperlink>
   </w:p>
   <w:p>
@@ -2632,6 +2653,16 @@
     <w:pPr>
       <w:pStyle w:val="Header"/>
       <w:jc w:val="center"/>
+    </w:pPr>
+  </w:p>
+</w:hdr>
+</file>
+
+<file path=word/header3.xml><?xml version="1.0" encoding="utf-8"?>
+<w:hdr xmlns:wpc="http://schemas.microsoft.com/office/word/2010/wordprocessingCanvas" xmlns:cx="http://schemas.microsoft.com/office/drawing/2014/chartex" xmlns:cx1="http://schemas.microsoft.com/office/drawing/2015/9/8/chartex" xmlns:cx2="http://schemas.microsoft.com/office/drawing/2015/10/21/chartex" xmlns:cx3="http://schemas.microsoft.com/office/drawing/2016/5/9/chartex" xmlns:cx4="http://schemas.microsoft.com/office/drawing/2016/5/10/chartex" xmlns:cx5="http://schemas.microsoft.com/office/drawing/2016/5/11/chartex" xmlns:cx6="http://schemas.microsoft.com/office/drawing/2016/5/12/chartex" xmlns:cx7="http://schemas.microsoft.com/office/drawing/2016/5/13/chartex" xmlns:cx8="http://schemas.microsoft.com/office/drawing/2016/5/14/chartex" xmlns:mc="http://schemas.openxmlformats.org/markup-compatibility/2006" xmlns:aink="http://schemas.microsoft.com/office/drawing/2016/ink" xmlns:am3d="http://schemas.microsoft.com/office/drawing/2017/model3d" xmlns:o="urn:schemas-microsoft-com:office:office" xmlns:r="http://schemas.openxmlformats.org/officeDocument/2006/relationships" xmlns:m="http://schemas.openxmlformats.org/officeDocument/2006/math" xmlns:v="urn:schemas-microsoft-com:vml" xmlns:wp14="http://schemas.microsoft.com/office/word/2010/wordprocessingDrawing" xmlns:wp="http://schemas.openxmlformats.org/drawingml/2006/wordprocessingDrawing" xmlns:w10="urn:schemas-microsoft-com:office:word" xmlns:w="http://schemas.openxmlformats.org/wordprocessingml/2006/main" xmlns:w14="http://schemas.microsoft.com/office/word/2010/wordml" xmlns:w15="http://schemas.microsoft.com/office/word/2012/wordml" xmlns:w16cid="http://schemas.microsoft.com/office/word/2016/wordml/cid" xmlns:w16se="http://schemas.microsoft.com/office/word/2015/wordml/symex" xmlns:wpg="http://schemas.microsoft.com/office/word/2010/wordprocessingGroup" xmlns:wpi="http://schemas.microsoft.com/office/word/2010/wordprocessingInk" xmlns:wne="http://schemas.microsoft.com/office/word/2006/wordml" xmlns:wps="http://schemas.microsoft.com/office/word/2010/wordprocessingShape" mc:Ignorable="w14 w15 w16se w16cid wp14">
+  <w:p>
+    <w:pPr>
+      <w:pStyle w:val="Header"/>
     </w:pPr>
   </w:p>
 </w:hdr>
@@ -3438,6 +3469,7 @@
   <w:style w:type="character" w:default="1" w:styleId="DefaultParagraphFont">
     <w:name w:val="Default Paragraph Font"/>
     <w:uiPriority w:val="1"/>
+    <w:semiHidden/>
     <w:unhideWhenUsed/>
   </w:style>
   <w:style w:type="table" w:default="1" w:styleId="TableNormal">

</xml_diff>